<commit_message>
actualización documentos fase 1 ingles y español por cambio de metodología
</commit_message>
<xml_diff>
--- a/Fase 1/Evidencias Grupales/1.5_GuiaEstudiante_Fase 1_Definicion Proyecto APT (Español).docx
+++ b/Fase 1/Evidencias Grupales/1.5_GuiaEstudiante_Fase 1_Definicion Proyecto APT (Español).docx
@@ -176,47 +176,77 @@
               </wp:anchor>
             </w:drawing>
           </mc:Choice>
-          <mc:Fallback xmlns:cr="http://schemas.microsoft.com/office/comments/2020/reactions" xmlns="http://schemas.microsoft.com/office/tasks/2019/documenttasks" xmlns:dgm="http://schemas.openxmlformats.org/drawingml/2006/diagram" xmlns:lc="http://schemas.openxmlformats.org/drawingml/2006/lockedCanvas" xmlns:c="http://schemas.openxmlformats.org/drawingml/2006/chart" xmlns:pic="http://schemas.openxmlformats.org/drawingml/2006/picture" xmlns:a="http://schemas.openxmlformats.org/drawingml/2006/main" xmlns:sl="http://schemas.openxmlformats.org/schemaLibrary/2006/main">
-            <w:drawing>
-              <wp:anchor allowOverlap="1" behindDoc="0" distB="0" distT="0" distL="114300" distR="114300" hidden="0" layoutInCell="1" locked="0" relativeHeight="0" simplePos="0">
-                <wp:simplePos x="0" y="0"/>
-                <wp:positionH relativeFrom="column">
-                  <wp:posOffset>-435398</wp:posOffset>
-                </wp:positionH>
-                <wp:positionV relativeFrom="paragraph">
-                  <wp:posOffset>33444</wp:posOffset>
-                </wp:positionV>
-                <wp:extent cx="6580505" cy="1486535"/>
-                <wp:effectExtent b="0" l="0" r="0" t="0"/>
-                <wp:wrapNone/>
-                <wp:docPr id="48" name="image2.png"/>
-                <a:graphic>
-                  <a:graphicData uri="http://schemas.openxmlformats.org/drawingml/2006/picture">
-                    <pic:pic>
-                      <pic:nvPicPr>
-                        <pic:cNvPr id="0" name="image2.png"/>
-                        <pic:cNvPicPr preferRelativeResize="0"/>
-                      </pic:nvPicPr>
-                      <pic:blipFill>
-                        <a:blip r:embed="rId8"/>
-                        <a:srcRect/>
-                        <a:stretch>
-                          <a:fillRect/>
-                        </a:stretch>
-                      </pic:blipFill>
-                      <pic:spPr>
-                        <a:xfrm>
-                          <a:off x="0" y="0"/>
-                          <a:ext cx="6580505" cy="1486535"/>
-                        </a:xfrm>
-                        <a:prstGeom prst="rect"/>
-                        <a:ln/>
-                      </pic:spPr>
-                    </pic:pic>
-                  </a:graphicData>
-                </a:graphic>
-              </wp:anchor>
-            </w:drawing>
+          <mc:Fallback>
+            <w:pict>
+              <v:group w14:anchorId="022A9375" id="Grupo 48" o:spid="_x0000_s1026" style="position:absolute;margin-left:-34.3pt;margin-top:2.65pt;width:518.15pt;height:117.05pt;z-index:251658240" coordorigin="20557,30367" coordsize="65805,14865" o:gfxdata="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">
+                <v:group id="Grupo 804273109" o:spid="_x0000_s1027" style="position:absolute;left:20557;top:30367;width:65805;height:14865" coordsize="59034,14868" o:gfxdata="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">
+                  <v:rect id="Rectángulo 128819622" o:spid="_x0000_s1028" style="position:absolute;width:59034;height:14868;visibility:visible;mso-wrap-style:square;v-text-anchor:middle" o:gfxdata="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" filled="f" stroked="f">
+                    <v:textbox inset="2.53958mm,2.53958mm,2.53958mm,2.53958mm">
+                      <w:txbxContent>
+                        <w:p>
+                          <w:pPr>
+                            <w:spacing w:after="0" w:line="240" w:lineRule="auto"/>
+                            <w:textDirection w:val="btLr"/>
+                          </w:pPr>
+                        </w:p>
+                      </w:txbxContent>
+                    </v:textbox>
+                  </v:rect>
+                  <v:rect id="Rectángulo 337964272" o:spid="_x0000_s1029" style="position:absolute;left:10247;top:2391;width:48787;height:12363;visibility:visible;mso-wrap-style:square;v-text-anchor:top" o:gfxdata="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" filled="f" stroked="f">
+                    <v:textbox inset="2.53958mm,1.2694mm,2.53958mm,1.2694mm">
+                      <w:txbxContent>
+                        <w:p>
+                          <w:pPr>
+                            <w:spacing w:after="0" w:line="240" w:lineRule="auto"/>
+                            <w:textDirection w:val="btLr"/>
+                          </w:pPr>
+                        </w:p>
+                        <w:p>
+                          <w:pPr>
+                            <w:spacing w:after="0" w:line="240" w:lineRule="auto"/>
+                            <w:textDirection w:val="btLr"/>
+                          </w:pPr>
+                          <w:r>
+                            <w:rPr>
+                              <w:b/>
+                              <w:color w:val="1F3864"/>
+                              <w:sz w:val="48"/>
+                            </w:rPr>
+                            <w:t xml:space="preserve">Guía1. Definición Proyecto APT </w:t>
+                          </w:r>
+                        </w:p>
+                        <w:p>
+                          <w:pPr>
+                            <w:spacing w:after="0" w:line="240" w:lineRule="auto"/>
+                            <w:textDirection w:val="btLr"/>
+                          </w:pPr>
+                          <w:r>
+                            <w:rPr>
+                              <w:b/>
+                              <w:color w:val="1F3864"/>
+                              <w:sz w:val="48"/>
+                            </w:rPr>
+                            <w:t>Asignatura Capstone</w:t>
+                          </w:r>
+                        </w:p>
+                      </w:txbxContent>
+                    </v:textbox>
+                  </v:rect>
+                  <v:rect id="Rectángulo 1278693726" o:spid="_x0000_s1030" style="position:absolute;width:9931;height:14868;visibility:visible;mso-wrap-style:square;v-text-anchor:middle" o:gfxdata="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" fillcolor="#1f3864" stroked="f">
+                    <v:textbox inset="2.53958mm,2.53958mm,2.53958mm,2.53958mm">
+                      <w:txbxContent>
+                        <w:p>
+                          <w:pPr>
+                            <w:spacing w:after="0" w:line="240" w:lineRule="auto"/>
+                            <w:textDirection w:val="btLr"/>
+                          </w:pPr>
+                        </w:p>
+                      </w:txbxContent>
+                    </v:textbox>
+                  </v:rect>
+                </v:group>
+              </v:group>
+            </w:pict>
           </mc:Fallback>
         </mc:AlternateContent>
       </w:r>
@@ -2436,31 +2466,41 @@
                 <w:sz w:val="20"/>
                 <w:szCs w:val="20"/>
               </w:rPr>
-              <w:t xml:space="preserve">El proyecto se desarrollará utilizando una metodología ágil, específicamente Scrum, organizada en </w:t>
-            </w:r>
-            <w:proofErr w:type="spellStart"/>
-            <w:r>
+              <w:t>El proyecto se desarrollará mediante un proceso lineal dividido en cuatro fases:</w:t>
+            </w:r>
+          </w:p>
+          <w:p>
+            <w:pPr>
+              <w:numPr>
+                <w:ilvl w:val="0"/>
+                <w:numId w:val="2"/>
+              </w:numPr>
+              <w:jc w:val="both"/>
               <w:rPr>
                 <w:i/>
                 <w:color w:val="548DD4"/>
                 <w:sz w:val="20"/>
                 <w:szCs w:val="20"/>
               </w:rPr>
-              <w:t>sprints</w:t>
-            </w:r>
-            <w:proofErr w:type="spellEnd"/>
-            <w:r>
-              <w:rPr>
+            </w:pPr>
+            <w:r>
+              <w:rPr>
+                <w:b/>
+                <w:bCs/>
                 <w:i/>
                 <w:color w:val="548DD4"/>
                 <w:sz w:val="20"/>
                 <w:szCs w:val="20"/>
               </w:rPr>
-              <w:t xml:space="preserve"> de dos semanas. Este enfoque permite avanzar en entregas incrementales, recibir retroalimentación temprana y realizar ajustes oportunos durante el proceso.</w:t>
-            </w:r>
-          </w:p>
-          <w:p>
-            <w:pPr>
+              <w:t>Definición y planificación</w:t>
+            </w:r>
+          </w:p>
+          <w:p>
+            <w:pPr>
+              <w:numPr>
+                <w:ilvl w:val="1"/>
+                <w:numId w:val="2"/>
+              </w:numPr>
               <w:jc w:val="both"/>
               <w:rPr>
                 <w:i/>
@@ -2476,11 +2516,15 @@
                 <w:sz w:val="20"/>
                 <w:szCs w:val="20"/>
               </w:rPr>
-              <w:t>Las etapas principales serán:</w:t>
-            </w:r>
-          </w:p>
-          <w:p>
-            <w:pPr>
+              <w:t>Elaboración del acta de constitución, definición de objetivos, alcance, requerimientos y análisis de factibilidad.</w:t>
+            </w:r>
+          </w:p>
+          <w:p>
+            <w:pPr>
+              <w:numPr>
+                <w:ilvl w:val="1"/>
+                <w:numId w:val="2"/>
+              </w:numPr>
               <w:jc w:val="both"/>
               <w:rPr>
                 <w:i/>
@@ -2496,11 +2540,15 @@
                 <w:sz w:val="20"/>
                 <w:szCs w:val="20"/>
               </w:rPr>
-              <w:t>Planificación: Definición del backlog del proyecto, asignación de tareas y establecimiento de responsables.</w:t>
-            </w:r>
-          </w:p>
-          <w:p>
-            <w:pPr>
+              <w:t>Entregable: Documento de definición del proyecto + diseño inicial de arquitectura y modelo de datos.</w:t>
+            </w:r>
+          </w:p>
+          <w:p>
+            <w:pPr>
+              <w:numPr>
+                <w:ilvl w:val="0"/>
+                <w:numId w:val="2"/>
+              </w:numPr>
               <w:jc w:val="both"/>
               <w:rPr>
                 <w:i/>
@@ -2511,16 +2559,22 @@
             </w:pPr>
             <w:r>
               <w:rPr>
+                <w:b/>
+                <w:bCs/>
                 <w:i/>
                 <w:color w:val="548DD4"/>
                 <w:sz w:val="20"/>
                 <w:szCs w:val="20"/>
               </w:rPr>
-              <w:t>Diseño: Elaboración de la arquitectura de la solución, el modelo de datos y los flujos de usuario.</w:t>
-            </w:r>
-          </w:p>
-          <w:p>
-            <w:pPr>
+              <w:t>Diseño y desarrollo parcial</w:t>
+            </w:r>
+          </w:p>
+          <w:p>
+            <w:pPr>
+              <w:numPr>
+                <w:ilvl w:val="1"/>
+                <w:numId w:val="2"/>
+              </w:numPr>
               <w:jc w:val="both"/>
               <w:rPr>
                 <w:i/>
@@ -2536,7 +2590,7 @@
                 <w:sz w:val="20"/>
                 <w:szCs w:val="20"/>
               </w:rPr>
-              <w:t xml:space="preserve">Desarrollo: Implementación del </w:t>
+              <w:t xml:space="preserve">Implementación inicial de </w:t>
             </w:r>
             <w:proofErr w:type="spellStart"/>
             <w:r>
@@ -2556,7 +2610,7 @@
                 <w:sz w:val="20"/>
                 <w:szCs w:val="20"/>
               </w:rPr>
-              <w:t xml:space="preserve"> en .NET 8, del </w:t>
+              <w:t xml:space="preserve"> (.NET: autenticación, agenda de citas) y </w:t>
             </w:r>
             <w:proofErr w:type="spellStart"/>
             <w:r>
@@ -2576,7 +2630,7 @@
                 <w:sz w:val="20"/>
                 <w:szCs w:val="20"/>
               </w:rPr>
-              <w:t xml:space="preserve"> en </w:t>
+              <w:t xml:space="preserve"> básico (</w:t>
             </w:r>
             <w:proofErr w:type="spellStart"/>
             <w:r>
@@ -2586,7 +2640,7 @@
                 <w:sz w:val="20"/>
                 <w:szCs w:val="20"/>
               </w:rPr>
-              <w:t>React</w:t>
+              <w:t>login</w:t>
             </w:r>
             <w:proofErr w:type="spellEnd"/>
             <w:r>
@@ -2596,11 +2650,15 @@
                 <w:sz w:val="20"/>
                 <w:szCs w:val="20"/>
               </w:rPr>
-              <w:t xml:space="preserve"> y la integración con el servicio de IA.</w:t>
-            </w:r>
-          </w:p>
-          <w:p>
-            <w:pPr>
+              <w:t>, agendamiento).</w:t>
+            </w:r>
+          </w:p>
+          <w:p>
+            <w:pPr>
+              <w:numPr>
+                <w:ilvl w:val="1"/>
+                <w:numId w:val="2"/>
+              </w:numPr>
               <w:jc w:val="both"/>
               <w:rPr>
                 <w:i/>
@@ -2616,11 +2674,15 @@
                 <w:sz w:val="20"/>
                 <w:szCs w:val="20"/>
               </w:rPr>
-              <w:t>Pruebas: Ejecución de pruebas unitarias, de integración y de usabilidad para asegurar la calidad del producto.</w:t>
-            </w:r>
-          </w:p>
-          <w:p>
-            <w:pPr>
+              <w:t>Entregable: Prototipo funcional parcial que evidencia factibilidad técnica.</w:t>
+            </w:r>
+          </w:p>
+          <w:p>
+            <w:pPr>
+              <w:numPr>
+                <w:ilvl w:val="0"/>
+                <w:numId w:val="2"/>
+              </w:numPr>
               <w:jc w:val="both"/>
               <w:rPr>
                 <w:i/>
@@ -2631,16 +2693,22 @@
             </w:pPr>
             <w:r>
               <w:rPr>
+                <w:b/>
+                <w:bCs/>
                 <w:i/>
                 <w:color w:val="548DD4"/>
                 <w:sz w:val="20"/>
                 <w:szCs w:val="20"/>
               </w:rPr>
-              <w:t>Documentación: Creación de la documentación técnica y del manual de usuario.</w:t>
-            </w:r>
-          </w:p>
-          <w:p>
-            <w:pPr>
+              <w:t>Desarrollo avanzado y pruebas</w:t>
+            </w:r>
+          </w:p>
+          <w:p>
+            <w:pPr>
+              <w:numPr>
+                <w:ilvl w:val="1"/>
+                <w:numId w:val="2"/>
+              </w:numPr>
               <w:jc w:val="both"/>
               <w:rPr>
                 <w:i/>
@@ -2656,11 +2724,16 @@
                 <w:sz w:val="20"/>
                 <w:szCs w:val="20"/>
               </w:rPr>
-              <w:t>Presentación: Preparación y exposición de la solución como producto final.</w:t>
-            </w:r>
-          </w:p>
-          <w:p>
-            <w:pPr>
+              <w:lastRenderedPageBreak/>
+              <w:t>Construcción del cuestionario de síntomas, motor de reglas, panel médico y reportes simples.</w:t>
+            </w:r>
+          </w:p>
+          <w:p>
+            <w:pPr>
+              <w:numPr>
+                <w:ilvl w:val="1"/>
+                <w:numId w:val="2"/>
+              </w:numPr>
               <w:jc w:val="both"/>
               <w:rPr>
                 <w:i/>
@@ -2676,12 +2749,15 @@
                 <w:sz w:val="20"/>
                 <w:szCs w:val="20"/>
               </w:rPr>
-              <w:lastRenderedPageBreak/>
-              <w:t>Roles y responsabilidades</w:t>
-            </w:r>
-          </w:p>
-          <w:p>
-            <w:pPr>
+              <w:t>Ejecución de pruebas unitarias e integración.</w:t>
+            </w:r>
+          </w:p>
+          <w:p>
+            <w:pPr>
+              <w:numPr>
+                <w:ilvl w:val="1"/>
+                <w:numId w:val="2"/>
+              </w:numPr>
               <w:jc w:val="both"/>
               <w:rPr>
                 <w:i/>
@@ -2697,7 +2773,7 @@
                 <w:sz w:val="20"/>
                 <w:szCs w:val="20"/>
               </w:rPr>
-              <w:t xml:space="preserve">Matías Cuevas: Líder técnico, encargado del </w:t>
+              <w:t>Entregable: MVP completo (</w:t>
             </w:r>
             <w:proofErr w:type="spellStart"/>
             <w:r>
@@ -2707,7 +2783,7 @@
                 <w:sz w:val="20"/>
                 <w:szCs w:val="20"/>
               </w:rPr>
-              <w:t>backend</w:t>
+              <w:t>MediTriage</w:t>
             </w:r>
             <w:proofErr w:type="spellEnd"/>
             <w:r>
@@ -2717,11 +2793,15 @@
                 <w:sz w:val="20"/>
                 <w:szCs w:val="20"/>
               </w:rPr>
-              <w:t>, la integración de la base de datos, la coordinación técnica y la documentación.</w:t>
-            </w:r>
-          </w:p>
-          <w:p>
-            <w:pPr>
+              <w:t>).</w:t>
+            </w:r>
+          </w:p>
+          <w:p>
+            <w:pPr>
+              <w:numPr>
+                <w:ilvl w:val="0"/>
+                <w:numId w:val="2"/>
+              </w:numPr>
               <w:jc w:val="both"/>
               <w:rPr>
                 <w:i/>
@@ -2732,24 +2812,30 @@
             </w:pPr>
             <w:r>
               <w:rPr>
+                <w:b/>
+                <w:bCs/>
                 <w:i/>
                 <w:color w:val="548DD4"/>
                 <w:sz w:val="20"/>
                 <w:szCs w:val="20"/>
               </w:rPr>
-              <w:t xml:space="preserve">Raúl Benavides: Desarrollador, encargado del </w:t>
-            </w:r>
-            <w:proofErr w:type="spellStart"/>
-            <w:r>
+              <w:t>Cierre y defensa final</w:t>
+            </w:r>
+          </w:p>
+          <w:p>
+            <w:pPr>
+              <w:numPr>
+                <w:ilvl w:val="1"/>
+                <w:numId w:val="2"/>
+              </w:numPr>
+              <w:jc w:val="both"/>
               <w:rPr>
                 <w:i/>
                 <w:color w:val="548DD4"/>
                 <w:sz w:val="20"/>
                 <w:szCs w:val="20"/>
               </w:rPr>
-              <w:t>frontend</w:t>
-            </w:r>
-            <w:proofErr w:type="spellEnd"/>
+            </w:pPr>
             <w:r>
               <w:rPr>
                 <w:i/>
@@ -2757,11 +2843,15 @@
                 <w:sz w:val="20"/>
                 <w:szCs w:val="20"/>
               </w:rPr>
-              <w:t>, pruebas de calidad y diseño de la interfaz de usuario.</w:t>
-            </w:r>
-          </w:p>
-          <w:p>
-            <w:pPr>
+              <w:t>Elaboración de documentación técnica y de usuario.</w:t>
+            </w:r>
+          </w:p>
+          <w:p>
+            <w:pPr>
+              <w:numPr>
+                <w:ilvl w:val="1"/>
+                <w:numId w:val="2"/>
+              </w:numPr>
               <w:jc w:val="both"/>
               <w:rPr>
                 <w:i/>
@@ -2777,11 +2867,15 @@
                 <w:sz w:val="20"/>
                 <w:szCs w:val="20"/>
               </w:rPr>
-              <w:t>Ambos integrantes: Levantamiento de requerimientos, control de versiones en GitHub, elaboración de reportes y preparación de la presentación final.</w:t>
-            </w:r>
-          </w:p>
-          <w:p>
-            <w:pPr>
+              <w:t>Preparación de la presentación y defensa ante la comisión evaluadora.</w:t>
+            </w:r>
+          </w:p>
+          <w:p>
+            <w:pPr>
+              <w:numPr>
+                <w:ilvl w:val="1"/>
+                <w:numId w:val="2"/>
+              </w:numPr>
               <w:jc w:val="both"/>
               <w:rPr>
                 <w:i/>
@@ -2797,8 +2891,206 @@
                 <w:sz w:val="20"/>
                 <w:szCs w:val="20"/>
               </w:rPr>
-              <w:t>Esta metodología asegura que el proyecto aborde de forma estructurada la problemática identificada y que se logren los objetivos planteados dentro del tiempo establecido.</w:t>
-            </w:r>
+              <w:t>Entregable: Presentación final, video demo y documentación completa.</w:t>
+            </w:r>
+          </w:p>
+          <w:p>
+            <w:pPr>
+              <w:jc w:val="both"/>
+              <w:rPr>
+                <w:i/>
+                <w:color w:val="548DD4"/>
+                <w:sz w:val="20"/>
+                <w:szCs w:val="20"/>
+              </w:rPr>
+            </w:pPr>
+            <w:r>
+              <w:rPr>
+                <w:b/>
+                <w:bCs/>
+                <w:i/>
+                <w:color w:val="548DD4"/>
+                <w:sz w:val="20"/>
+                <w:szCs w:val="20"/>
+              </w:rPr>
+              <w:t>Roles y responsabilidades</w:t>
+            </w:r>
+          </w:p>
+          <w:p>
+            <w:pPr>
+              <w:numPr>
+                <w:ilvl w:val="0"/>
+                <w:numId w:val="3"/>
+              </w:numPr>
+              <w:jc w:val="both"/>
+              <w:rPr>
+                <w:i/>
+                <w:color w:val="548DD4"/>
+                <w:sz w:val="20"/>
+                <w:szCs w:val="20"/>
+              </w:rPr>
+            </w:pPr>
+            <w:r>
+              <w:rPr>
+                <w:b/>
+                <w:bCs/>
+                <w:i/>
+                <w:color w:val="548DD4"/>
+                <w:sz w:val="20"/>
+                <w:szCs w:val="20"/>
+              </w:rPr>
+              <w:t>Matías Cuevas</w:t>
+            </w:r>
+            <w:r>
+              <w:rPr>
+                <w:i/>
+                <w:color w:val="548DD4"/>
+                <w:sz w:val="20"/>
+                <w:szCs w:val="20"/>
+              </w:rPr>
+              <w:t xml:space="preserve">: Líder técnico, encargado del </w:t>
+            </w:r>
+            <w:proofErr w:type="spellStart"/>
+            <w:r>
+              <w:rPr>
+                <w:i/>
+                <w:color w:val="548DD4"/>
+                <w:sz w:val="20"/>
+                <w:szCs w:val="20"/>
+              </w:rPr>
+              <w:t>backend</w:t>
+            </w:r>
+            <w:proofErr w:type="spellEnd"/>
+            <w:r>
+              <w:rPr>
+                <w:i/>
+                <w:color w:val="548DD4"/>
+                <w:sz w:val="20"/>
+                <w:szCs w:val="20"/>
+              </w:rPr>
+              <w:t>, la integración de la base de datos y la coordinación técnica.</w:t>
+            </w:r>
+          </w:p>
+          <w:p>
+            <w:pPr>
+              <w:numPr>
+                <w:ilvl w:val="0"/>
+                <w:numId w:val="3"/>
+              </w:numPr>
+              <w:jc w:val="both"/>
+              <w:rPr>
+                <w:i/>
+                <w:color w:val="548DD4"/>
+                <w:sz w:val="20"/>
+                <w:szCs w:val="20"/>
+              </w:rPr>
+            </w:pPr>
+            <w:r>
+              <w:rPr>
+                <w:b/>
+                <w:bCs/>
+                <w:i/>
+                <w:color w:val="548DD4"/>
+                <w:sz w:val="20"/>
+                <w:szCs w:val="20"/>
+              </w:rPr>
+              <w:t>Raúl Benavides</w:t>
+            </w:r>
+            <w:r>
+              <w:rPr>
+                <w:i/>
+                <w:color w:val="548DD4"/>
+                <w:sz w:val="20"/>
+                <w:szCs w:val="20"/>
+              </w:rPr>
+              <w:t xml:space="preserve">: Desarrollador, encargado del </w:t>
+            </w:r>
+            <w:proofErr w:type="spellStart"/>
+            <w:r>
+              <w:rPr>
+                <w:i/>
+                <w:color w:val="548DD4"/>
+                <w:sz w:val="20"/>
+                <w:szCs w:val="20"/>
+              </w:rPr>
+              <w:t>frontend</w:t>
+            </w:r>
+            <w:proofErr w:type="spellEnd"/>
+            <w:r>
+              <w:rPr>
+                <w:i/>
+                <w:color w:val="548DD4"/>
+                <w:sz w:val="20"/>
+                <w:szCs w:val="20"/>
+              </w:rPr>
+              <w:t>, pruebas de calidad y diseño de la interfaz de usuario.</w:t>
+            </w:r>
+          </w:p>
+          <w:p>
+            <w:pPr>
+              <w:numPr>
+                <w:ilvl w:val="0"/>
+                <w:numId w:val="3"/>
+              </w:numPr>
+              <w:jc w:val="both"/>
+              <w:rPr>
+                <w:i/>
+                <w:color w:val="548DD4"/>
+                <w:sz w:val="20"/>
+                <w:szCs w:val="20"/>
+              </w:rPr>
+            </w:pPr>
+            <w:r>
+              <w:rPr>
+                <w:b/>
+                <w:bCs/>
+                <w:i/>
+                <w:color w:val="548DD4"/>
+                <w:sz w:val="20"/>
+                <w:szCs w:val="20"/>
+              </w:rPr>
+              <w:t>Ambos integrantes</w:t>
+            </w:r>
+            <w:r>
+              <w:rPr>
+                <w:i/>
+                <w:color w:val="548DD4"/>
+                <w:sz w:val="20"/>
+                <w:szCs w:val="20"/>
+              </w:rPr>
+              <w:t>: Levantamiento de requerimientos, control de versiones en GitHub, elaboración de reportes y preparación de la presentación final.</w:t>
+            </w:r>
+          </w:p>
+          <w:p>
+            <w:pPr>
+              <w:jc w:val="both"/>
+              <w:rPr>
+                <w:i/>
+                <w:color w:val="548DD4"/>
+                <w:sz w:val="20"/>
+                <w:szCs w:val="20"/>
+              </w:rPr>
+            </w:pPr>
+            <w:r>
+              <w:rPr>
+                <w:i/>
+                <w:color w:val="548DD4"/>
+                <w:sz w:val="20"/>
+                <w:szCs w:val="20"/>
+              </w:rPr>
+              <w:t>Este enfoque asegura que el proyecto avance de manera ordenada, acumulando entregables validados en cada fase, y cumpla con los tiempos y objetivos académicos establecidos.</w:t>
+            </w:r>
+          </w:p>
+          <w:p>
+            <w:pPr>
+              <w:jc w:val="both"/>
+              <w:rPr>
+                <w:i/>
+                <w:color w:val="548DD4"/>
+                <w:sz w:val="20"/>
+                <w:szCs w:val="20"/>
+              </w:rPr>
+            </w:pPr>
           </w:p>
         </w:tc>
       </w:tr>
@@ -6820,7 +7112,7 @@
     <w:p>
       <w:pPr>
         <w:sectPr>
-          <w:headerReference w:type="default" r:id="rId9"/>
+          <w:headerReference w:type="default" r:id="rId8"/>
           <w:pgSz w:w="11906" w:h="16838"/>
           <w:pgMar w:top="1417" w:right="1701" w:bottom="1417" w:left="1701" w:header="708" w:footer="708" w:gutter="0"/>
           <w:pgNumType w:start="1"/>
@@ -17883,7 +18175,6 @@
         </w:tc>
       </w:tr>
     </w:tbl>
-    <w:p/>
     <w:p/>
     <w:sectPr>
       <w:pgSz w:w="16838" w:h="11906" w:orient="landscape"/>
@@ -18261,8 +18552,280 @@
       </w:pPr>
     </w:lvl>
   </w:abstractNum>
+  <w:abstractNum w:abstractNumId="1" w15:restartNumberingAfterBreak="0">
+    <w:nsid w:val="20714B08"/>
+    <w:multiLevelType w:val="multilevel"/>
+    <w:tmpl w:val="7BE2F490"/>
+    <w:lvl w:ilvl="0">
+      <w:start w:val="1"/>
+      <w:numFmt w:val="bullet"/>
+      <w:lvlText w:val=""/>
+      <w:lvlJc w:val="left"/>
+      <w:pPr>
+        <w:tabs>
+          <w:tab w:val="num" w:pos="720"/>
+        </w:tabs>
+        <w:ind w:left="720" w:hanging="360"/>
+      </w:pPr>
+      <w:rPr>
+        <w:rFonts w:ascii="Symbol" w:hAnsi="Symbol" w:hint="default"/>
+        <w:sz w:val="20"/>
+      </w:rPr>
+    </w:lvl>
+    <w:lvl w:ilvl="1" w:tentative="1">
+      <w:start w:val="1"/>
+      <w:numFmt w:val="bullet"/>
+      <w:lvlText w:val="o"/>
+      <w:lvlJc w:val="left"/>
+      <w:pPr>
+        <w:tabs>
+          <w:tab w:val="num" w:pos="1440"/>
+        </w:tabs>
+        <w:ind w:left="1440" w:hanging="360"/>
+      </w:pPr>
+      <w:rPr>
+        <w:rFonts w:ascii="Courier New" w:hAnsi="Courier New" w:hint="default"/>
+        <w:sz w:val="20"/>
+      </w:rPr>
+    </w:lvl>
+    <w:lvl w:ilvl="2" w:tentative="1">
+      <w:start w:val="1"/>
+      <w:numFmt w:val="bullet"/>
+      <w:lvlText w:val=""/>
+      <w:lvlJc w:val="left"/>
+      <w:pPr>
+        <w:tabs>
+          <w:tab w:val="num" w:pos="2160"/>
+        </w:tabs>
+        <w:ind w:left="2160" w:hanging="360"/>
+      </w:pPr>
+      <w:rPr>
+        <w:rFonts w:ascii="Wingdings" w:hAnsi="Wingdings" w:hint="default"/>
+        <w:sz w:val="20"/>
+      </w:rPr>
+    </w:lvl>
+    <w:lvl w:ilvl="3" w:tentative="1">
+      <w:start w:val="1"/>
+      <w:numFmt w:val="bullet"/>
+      <w:lvlText w:val=""/>
+      <w:lvlJc w:val="left"/>
+      <w:pPr>
+        <w:tabs>
+          <w:tab w:val="num" w:pos="2880"/>
+        </w:tabs>
+        <w:ind w:left="2880" w:hanging="360"/>
+      </w:pPr>
+      <w:rPr>
+        <w:rFonts w:ascii="Wingdings" w:hAnsi="Wingdings" w:hint="default"/>
+        <w:sz w:val="20"/>
+      </w:rPr>
+    </w:lvl>
+    <w:lvl w:ilvl="4" w:tentative="1">
+      <w:start w:val="1"/>
+      <w:numFmt w:val="bullet"/>
+      <w:lvlText w:val=""/>
+      <w:lvlJc w:val="left"/>
+      <w:pPr>
+        <w:tabs>
+          <w:tab w:val="num" w:pos="3600"/>
+        </w:tabs>
+        <w:ind w:left="3600" w:hanging="360"/>
+      </w:pPr>
+      <w:rPr>
+        <w:rFonts w:ascii="Wingdings" w:hAnsi="Wingdings" w:hint="default"/>
+        <w:sz w:val="20"/>
+      </w:rPr>
+    </w:lvl>
+    <w:lvl w:ilvl="5" w:tentative="1">
+      <w:start w:val="1"/>
+      <w:numFmt w:val="bullet"/>
+      <w:lvlText w:val=""/>
+      <w:lvlJc w:val="left"/>
+      <w:pPr>
+        <w:tabs>
+          <w:tab w:val="num" w:pos="4320"/>
+        </w:tabs>
+        <w:ind w:left="4320" w:hanging="360"/>
+      </w:pPr>
+      <w:rPr>
+        <w:rFonts w:ascii="Wingdings" w:hAnsi="Wingdings" w:hint="default"/>
+        <w:sz w:val="20"/>
+      </w:rPr>
+    </w:lvl>
+    <w:lvl w:ilvl="6" w:tentative="1">
+      <w:start w:val="1"/>
+      <w:numFmt w:val="bullet"/>
+      <w:lvlText w:val=""/>
+      <w:lvlJc w:val="left"/>
+      <w:pPr>
+        <w:tabs>
+          <w:tab w:val="num" w:pos="5040"/>
+        </w:tabs>
+        <w:ind w:left="5040" w:hanging="360"/>
+      </w:pPr>
+      <w:rPr>
+        <w:rFonts w:ascii="Wingdings" w:hAnsi="Wingdings" w:hint="default"/>
+        <w:sz w:val="20"/>
+      </w:rPr>
+    </w:lvl>
+    <w:lvl w:ilvl="7" w:tentative="1">
+      <w:start w:val="1"/>
+      <w:numFmt w:val="bullet"/>
+      <w:lvlText w:val=""/>
+      <w:lvlJc w:val="left"/>
+      <w:pPr>
+        <w:tabs>
+          <w:tab w:val="num" w:pos="5760"/>
+        </w:tabs>
+        <w:ind w:left="5760" w:hanging="360"/>
+      </w:pPr>
+      <w:rPr>
+        <w:rFonts w:ascii="Wingdings" w:hAnsi="Wingdings" w:hint="default"/>
+        <w:sz w:val="20"/>
+      </w:rPr>
+    </w:lvl>
+    <w:lvl w:ilvl="8" w:tentative="1">
+      <w:start w:val="1"/>
+      <w:numFmt w:val="bullet"/>
+      <w:lvlText w:val=""/>
+      <w:lvlJc w:val="left"/>
+      <w:pPr>
+        <w:tabs>
+          <w:tab w:val="num" w:pos="6480"/>
+        </w:tabs>
+        <w:ind w:left="6480" w:hanging="360"/>
+      </w:pPr>
+      <w:rPr>
+        <w:rFonts w:ascii="Wingdings" w:hAnsi="Wingdings" w:hint="default"/>
+        <w:sz w:val="20"/>
+      </w:rPr>
+    </w:lvl>
+  </w:abstractNum>
+  <w:abstractNum w:abstractNumId="2" w15:restartNumberingAfterBreak="0">
+    <w:nsid w:val="2D7B0049"/>
+    <w:multiLevelType w:val="multilevel"/>
+    <w:tmpl w:val="22E29044"/>
+    <w:lvl w:ilvl="0">
+      <w:start w:val="1"/>
+      <w:numFmt w:val="decimal"/>
+      <w:lvlText w:val="%1."/>
+      <w:lvlJc w:val="left"/>
+      <w:pPr>
+        <w:tabs>
+          <w:tab w:val="num" w:pos="720"/>
+        </w:tabs>
+        <w:ind w:left="720" w:hanging="360"/>
+      </w:pPr>
+    </w:lvl>
+    <w:lvl w:ilvl="1">
+      <w:start w:val="1"/>
+      <w:numFmt w:val="bullet"/>
+      <w:lvlText w:val="o"/>
+      <w:lvlJc w:val="left"/>
+      <w:pPr>
+        <w:tabs>
+          <w:tab w:val="num" w:pos="1440"/>
+        </w:tabs>
+        <w:ind w:left="1440" w:hanging="360"/>
+      </w:pPr>
+      <w:rPr>
+        <w:rFonts w:ascii="Courier New" w:hAnsi="Courier New" w:hint="default"/>
+        <w:sz w:val="20"/>
+      </w:rPr>
+    </w:lvl>
+    <w:lvl w:ilvl="2" w:tentative="1">
+      <w:start w:val="1"/>
+      <w:numFmt w:val="decimal"/>
+      <w:lvlText w:val="%3."/>
+      <w:lvlJc w:val="left"/>
+      <w:pPr>
+        <w:tabs>
+          <w:tab w:val="num" w:pos="2160"/>
+        </w:tabs>
+        <w:ind w:left="2160" w:hanging="360"/>
+      </w:pPr>
+    </w:lvl>
+    <w:lvl w:ilvl="3" w:tentative="1">
+      <w:start w:val="1"/>
+      <w:numFmt w:val="decimal"/>
+      <w:lvlText w:val="%4."/>
+      <w:lvlJc w:val="left"/>
+      <w:pPr>
+        <w:tabs>
+          <w:tab w:val="num" w:pos="2880"/>
+        </w:tabs>
+        <w:ind w:left="2880" w:hanging="360"/>
+      </w:pPr>
+    </w:lvl>
+    <w:lvl w:ilvl="4" w:tentative="1">
+      <w:start w:val="1"/>
+      <w:numFmt w:val="decimal"/>
+      <w:lvlText w:val="%5."/>
+      <w:lvlJc w:val="left"/>
+      <w:pPr>
+        <w:tabs>
+          <w:tab w:val="num" w:pos="3600"/>
+        </w:tabs>
+        <w:ind w:left="3600" w:hanging="360"/>
+      </w:pPr>
+    </w:lvl>
+    <w:lvl w:ilvl="5" w:tentative="1">
+      <w:start w:val="1"/>
+      <w:numFmt w:val="decimal"/>
+      <w:lvlText w:val="%6."/>
+      <w:lvlJc w:val="left"/>
+      <w:pPr>
+        <w:tabs>
+          <w:tab w:val="num" w:pos="4320"/>
+        </w:tabs>
+        <w:ind w:left="4320" w:hanging="360"/>
+      </w:pPr>
+    </w:lvl>
+    <w:lvl w:ilvl="6" w:tentative="1">
+      <w:start w:val="1"/>
+      <w:numFmt w:val="decimal"/>
+      <w:lvlText w:val="%7."/>
+      <w:lvlJc w:val="left"/>
+      <w:pPr>
+        <w:tabs>
+          <w:tab w:val="num" w:pos="5040"/>
+        </w:tabs>
+        <w:ind w:left="5040" w:hanging="360"/>
+      </w:pPr>
+    </w:lvl>
+    <w:lvl w:ilvl="7" w:tentative="1">
+      <w:start w:val="1"/>
+      <w:numFmt w:val="decimal"/>
+      <w:lvlText w:val="%8."/>
+      <w:lvlJc w:val="left"/>
+      <w:pPr>
+        <w:tabs>
+          <w:tab w:val="num" w:pos="5760"/>
+        </w:tabs>
+        <w:ind w:left="5760" w:hanging="360"/>
+      </w:pPr>
+    </w:lvl>
+    <w:lvl w:ilvl="8" w:tentative="1">
+      <w:start w:val="1"/>
+      <w:numFmt w:val="decimal"/>
+      <w:lvlText w:val="%9."/>
+      <w:lvlJc w:val="left"/>
+      <w:pPr>
+        <w:tabs>
+          <w:tab w:val="num" w:pos="6480"/>
+        </w:tabs>
+        <w:ind w:left="6480" w:hanging="360"/>
+      </w:pPr>
+    </w:lvl>
+  </w:abstractNum>
   <w:num w:numId="1" w16cid:durableId="653336372">
     <w:abstractNumId w:val="0"/>
+  </w:num>
+  <w:num w:numId="2" w16cid:durableId="383871450">
+    <w:abstractNumId w:val="2"/>
+  </w:num>
+  <w:num w:numId="3" w16cid:durableId="1583370123">
+    <w:abstractNumId w:val="1"/>
   </w:num>
 </w:numbering>
 </file>
@@ -18785,7 +19348,6 @@
   <w:style w:type="character" w:default="1" w:styleId="Fuentedeprrafopredeter">
     <w:name w:val="Default Paragraph Font"/>
     <w:uiPriority w:val="1"/>
-    <w:semiHidden/>
     <w:unhideWhenUsed/>
   </w:style>
   <w:style w:type="table" w:default="1" w:styleId="Tablanormal">

</xml_diff>